<commit_message>
Meeting Minutes/Release and Sprint Plan and DB Photo
</commit_message>
<xml_diff>
--- a/Non Code Files/Release Plans.docx
+++ b/Non Code Files/Release Plans.docx
@@ -3,38 +3,83 @@
 <w:document xmlns:wpc="http://schemas.microsoft.com/office/word/2010/wordprocessingCanvas" xmlns:cx="http://schemas.microsoft.com/office/drawing/2014/chartex" xmlns:cx1="http://schemas.microsoft.com/office/drawing/2015/9/8/chartex" xmlns:cx2="http://schemas.microsoft.com/office/drawing/2015/10/21/chartex" xmlns:cx3="http://schemas.microsoft.com/office/drawing/2016/5/9/chartex" xmlns:cx4="http://schemas.microsoft.com/office/drawing/2016/5/10/chartex" xmlns:cx5="http://schemas.microsoft.com/office/drawing/2016/5/11/chartex" xmlns:cx6="http://schemas.microsoft.com/office/drawing/2016/5/12/chartex" xmlns:cx7="http://schemas.microsoft.com/office/drawing/2016/5/13/chartex" xmlns:cx8="http://schemas.microsoft.com/office/drawing/2016/5/14/chartex" xmlns:mc="http://schemas.openxmlformats.org/markup-compatibility/2006" xmlns:aink="http://schemas.microsoft.com/office/drawing/2016/ink" xmlns:am3d="http://schemas.microsoft.com/office/drawing/2017/model3d" xmlns:o="urn:schemas-microsoft-com:office:office" xmlns:oel="http://schemas.microsoft.com/office/2019/extlst" xmlns:r="http://schemas.openxmlformats.org/officeDocument/2006/relationships" xmlns:m="http://schemas.openxmlformats.org/officeDocument/2006/math" xmlns:v="urn:schemas-microsoft-com:vml" xmlns:wp14="http://schemas.microsoft.com/office/word/2010/wordprocessingDrawing" xmlns:wp="http://schemas.openxmlformats.org/drawingml/2006/wordprocessingDrawing" xmlns:w10="urn:schemas-microsoft-com:office:word" xmlns:w="http://schemas.openxmlformats.org/wordprocessingml/2006/main" xmlns:w14="http://schemas.microsoft.com/office/word/2010/wordml" xmlns:w15="http://schemas.microsoft.com/office/word/2012/wordml" xmlns:w16cex="http://schemas.microsoft.com/office/word/2018/wordml/cex" xmlns:w16cid="http://schemas.microsoft.com/office/word/2016/wordml/cid" xmlns:w16="http://schemas.microsoft.com/office/word/2018/wordml" xmlns:w16du="http://schemas.microsoft.com/office/word/2023/wordml/word16du" xmlns:w16sdtdh="http://schemas.microsoft.com/office/word/2020/wordml/sdtdatahash" xmlns:w16sdtfl="http://schemas.microsoft.com/office/word/2024/wordml/sdtformatlock" xmlns:w16se="http://schemas.microsoft.com/office/word/2015/wordml/symex" xmlns:wpg="http://schemas.microsoft.com/office/word/2010/wordprocessingGroup" xmlns:wpi="http://schemas.microsoft.com/office/word/2010/wordprocessingInk" xmlns:wne="http://schemas.microsoft.com/office/word/2006/wordml" xmlns:wps="http://schemas.microsoft.com/office/word/2010/wordprocessingShape" mc:Ignorable="w14 w15 w16se w16cid w16 w16cex w16sdtdh w16sdtfl w16du wp14">
   <w:body>
     <w:p>
-      <w:r>
-        <w:rPr>
+      <w:pPr>
+        <w:rPr>
+          <w:b/>
+          <w:bCs/>
           <w:u w:val="single"/>
         </w:rPr>
+      </w:pPr>
+      <w:r>
+        <w:rPr>
+          <w:b/>
+          <w:bCs/>
+          <w:u w:val="single"/>
+        </w:rPr>
         <w:t>Release plan for Stockle application</w:t>
-      </w:r>
-    </w:p>
-    <w:p/>
-    <w:p>
-      <w:r>
-        <w:t>27/3/26 week 5</w:t>
       </w:r>
     </w:p>
     <w:p>
       <w:pPr>
+        <w:rPr>
+          <w:b/>
+          <w:bCs/>
+          <w:u w:val="single"/>
+        </w:rPr>
+      </w:pPr>
+      <w:r>
+        <w:rPr>
+          <w:b/>
+          <w:bCs/>
+          <w:u w:val="single"/>
+        </w:rPr>
+        <w:t>27/3/26 week 5</w:t>
+      </w:r>
+    </w:p>
+    <w:p>
+      <w:pPr>
         <w:numPr>
           <w:ilvl w:val="0"/>
-          <w:numId w:val="1"/>
+          <w:numId w:val="6"/>
         </w:numPr>
-      </w:pPr>
-      <w:r>
-        <w:t>Create team and create channel to communicate with eachother</w:t>
-      </w:r>
+        <w:rPr>
+          <w:sz w:val="22"/>
+          <w:szCs w:val="22"/>
+        </w:rPr>
+      </w:pPr>
+      <w:r>
+        <w:rPr>
+          <w:sz w:val="22"/>
+          <w:szCs w:val="22"/>
+        </w:rPr>
+        <w:t xml:space="preserve">Create team and create channel to communicate with </w:t>
+      </w:r>
+      <w:proofErr w:type="spellStart"/>
+      <w:r>
+        <w:rPr>
+          <w:sz w:val="22"/>
+          <w:szCs w:val="22"/>
+        </w:rPr>
+        <w:t>eachother</w:t>
+      </w:r>
+      <w:proofErr w:type="spellEnd"/>
     </w:p>
     <w:p>
       <w:pPr>
         <w:numPr>
           <w:ilvl w:val="0"/>
-          <w:numId w:val="1"/>
+          <w:numId w:val="6"/>
         </w:numPr>
-      </w:pPr>
-      <w:r>
+        <w:rPr>
+          <w:sz w:val="22"/>
+          <w:szCs w:val="22"/>
+        </w:rPr>
+      </w:pPr>
+      <w:r>
+        <w:rPr>
+          <w:sz w:val="22"/>
+          <w:szCs w:val="22"/>
+        </w:rPr>
         <w:t>Create project idea, brief and list of requirements for implementation</w:t>
       </w:r>
     </w:p>
@@ -42,49 +87,156 @@
       <w:pPr>
         <w:numPr>
           <w:ilvl w:val="0"/>
-          <w:numId w:val="1"/>
+          <w:numId w:val="6"/>
         </w:numPr>
-      </w:pPr>
-      <w:r>
-        <w:t>Create a github repository as well as a Github projects page to manage development</w:t>
-      </w:r>
-    </w:p>
-    <w:p/>
-    <w:p>
-      <w:r>
-        <w:t>17/4/26 week 7</w:t>
+        <w:rPr>
+          <w:sz w:val="22"/>
+          <w:szCs w:val="22"/>
+        </w:rPr>
+      </w:pPr>
+      <w:r>
+        <w:rPr>
+          <w:sz w:val="22"/>
+          <w:szCs w:val="22"/>
+        </w:rPr>
+        <w:t xml:space="preserve">Create a </w:t>
+      </w:r>
+      <w:proofErr w:type="spellStart"/>
+      <w:r>
+        <w:rPr>
+          <w:sz w:val="22"/>
+          <w:szCs w:val="22"/>
+        </w:rPr>
+        <w:t>github</w:t>
+      </w:r>
+      <w:proofErr w:type="spellEnd"/>
+      <w:r>
+        <w:rPr>
+          <w:sz w:val="22"/>
+          <w:szCs w:val="22"/>
+        </w:rPr>
+        <w:t xml:space="preserve"> repository as well as a </w:t>
+      </w:r>
+      <w:proofErr w:type="spellStart"/>
+      <w:r>
+        <w:rPr>
+          <w:sz w:val="22"/>
+          <w:szCs w:val="22"/>
+        </w:rPr>
+        <w:t>Github</w:t>
+      </w:r>
+      <w:proofErr w:type="spellEnd"/>
+      <w:r>
+        <w:rPr>
+          <w:sz w:val="22"/>
+          <w:szCs w:val="22"/>
+        </w:rPr>
+        <w:t xml:space="preserve"> projects page to manage development</w:t>
       </w:r>
     </w:p>
     <w:p>
       <w:pPr>
+        <w:rPr>
+          <w:b/>
+          <w:bCs/>
+          <w:u w:val="single"/>
+        </w:rPr>
+      </w:pPr>
+      <w:r>
+        <w:rPr>
+          <w:b/>
+          <w:bCs/>
+          <w:u w:val="single"/>
+        </w:rPr>
+        <w:t>17/4/26 week 7</w:t>
+      </w:r>
+    </w:p>
+    <w:p>
+      <w:pPr>
         <w:numPr>
           <w:ilvl w:val="0"/>
-          <w:numId w:val="2"/>
+          <w:numId w:val="7"/>
         </w:numPr>
-      </w:pPr>
-      <w:r>
-        <w:t>Create completed user stories and input them into the github projects page</w:t>
+        <w:rPr>
+          <w:sz w:val="22"/>
+          <w:szCs w:val="22"/>
+        </w:rPr>
+      </w:pPr>
+      <w:r>
+        <w:rPr>
+          <w:sz w:val="22"/>
+          <w:szCs w:val="22"/>
+        </w:rPr>
+        <w:t xml:space="preserve">Create completed user stories and input them into the </w:t>
+      </w:r>
+      <w:proofErr w:type="spellStart"/>
+      <w:r>
+        <w:rPr>
+          <w:sz w:val="22"/>
+          <w:szCs w:val="22"/>
+        </w:rPr>
+        <w:t>github</w:t>
+      </w:r>
+      <w:proofErr w:type="spellEnd"/>
+      <w:r>
+        <w:rPr>
+          <w:sz w:val="22"/>
+          <w:szCs w:val="22"/>
+        </w:rPr>
+        <w:t xml:space="preserve"> projects page</w:t>
       </w:r>
     </w:p>
     <w:p>
       <w:pPr>
         <w:numPr>
           <w:ilvl w:val="0"/>
-          <w:numId w:val="2"/>
+          <w:numId w:val="7"/>
         </w:numPr>
-      </w:pPr>
-      <w:r>
-        <w:t>Configure the github projects page to better suit project requirements</w:t>
+        <w:rPr>
+          <w:sz w:val="22"/>
+          <w:szCs w:val="22"/>
+        </w:rPr>
+      </w:pPr>
+      <w:r>
+        <w:rPr>
+          <w:sz w:val="22"/>
+          <w:szCs w:val="22"/>
+        </w:rPr>
+        <w:t xml:space="preserve">Configure the </w:t>
+      </w:r>
+      <w:proofErr w:type="spellStart"/>
+      <w:r>
+        <w:rPr>
+          <w:sz w:val="22"/>
+          <w:szCs w:val="22"/>
+        </w:rPr>
+        <w:t>github</w:t>
+      </w:r>
+      <w:proofErr w:type="spellEnd"/>
+      <w:r>
+        <w:rPr>
+          <w:sz w:val="22"/>
+          <w:szCs w:val="22"/>
+        </w:rPr>
+        <w:t xml:space="preserve"> projects page to better suit project requirements</w:t>
       </w:r>
     </w:p>
     <w:p>
       <w:pPr>
         <w:numPr>
           <w:ilvl w:val="0"/>
-          <w:numId w:val="2"/>
+          <w:numId w:val="7"/>
         </w:numPr>
-      </w:pPr>
-      <w:r>
+        <w:rPr>
+          <w:sz w:val="22"/>
+          <w:szCs w:val="22"/>
+        </w:rPr>
+      </w:pPr>
+      <w:r>
+        <w:rPr>
+          <w:sz w:val="22"/>
+          <w:szCs w:val="22"/>
+        </w:rPr>
         <w:t>Work has been commenced on the project and coding has begun</w:t>
       </w:r>
     </w:p>
@@ -92,27 +244,54 @@
       <w:pPr>
         <w:numPr>
           <w:ilvl w:val="0"/>
-          <w:numId w:val="2"/>
+          <w:numId w:val="7"/>
         </w:numPr>
-      </w:pPr>
-      <w:r>
+        <w:rPr>
+          <w:sz w:val="22"/>
+          <w:szCs w:val="22"/>
+        </w:rPr>
+      </w:pPr>
+      <w:r>
+        <w:rPr>
+          <w:sz w:val="22"/>
+          <w:szCs w:val="22"/>
+        </w:rPr>
         <w:t>High quality UI designs have been created in both low and medium fidelity to be used as a reference</w:t>
-      </w:r>
-    </w:p>
-    <w:p/>
-    <w:p>
-      <w:r>
-        <w:t>1/5/26 week 9</w:t>
       </w:r>
     </w:p>
     <w:p>
       <w:pPr>
+        <w:rPr>
+          <w:b/>
+          <w:bCs/>
+          <w:u w:val="single"/>
+        </w:rPr>
+      </w:pPr>
+      <w:r>
+        <w:rPr>
+          <w:b/>
+          <w:bCs/>
+          <w:u w:val="single"/>
+        </w:rPr>
+        <w:t>1/5/26 week 9</w:t>
+      </w:r>
+    </w:p>
+    <w:p>
+      <w:pPr>
         <w:numPr>
           <w:ilvl w:val="0"/>
-          <w:numId w:val="3"/>
+          <w:numId w:val="8"/>
         </w:numPr>
-      </w:pPr>
-      <w:r>
+        <w:rPr>
+          <w:sz w:val="22"/>
+          <w:szCs w:val="22"/>
+        </w:rPr>
+      </w:pPr>
+      <w:r>
+        <w:rPr>
+          <w:sz w:val="22"/>
+          <w:szCs w:val="22"/>
+        </w:rPr>
         <w:t>A prototype has been created with basic core features implemented.</w:t>
       </w:r>
     </w:p>
@@ -120,21 +299,69 @@
       <w:pPr>
         <w:numPr>
           <w:ilvl w:val="0"/>
-          <w:numId w:val="3"/>
+          <w:numId w:val="8"/>
         </w:numPr>
-      </w:pPr>
-      <w:r>
-        <w:t>A prototype with Database, login/user system, LLM integration, API interaction and a User interface are implemented</w:t>
+        <w:rPr>
+          <w:sz w:val="22"/>
+          <w:szCs w:val="22"/>
+        </w:rPr>
+      </w:pPr>
+      <w:r>
+        <w:rPr>
+          <w:sz w:val="22"/>
+          <w:szCs w:val="22"/>
+        </w:rPr>
+        <w:t xml:space="preserve">A prototype with Database, login/user system, LLM integration, API interaction and a </w:t>
+      </w:r>
+      <w:proofErr w:type="gramStart"/>
+      <w:r>
+        <w:rPr>
+          <w:sz w:val="22"/>
+          <w:szCs w:val="22"/>
+        </w:rPr>
+        <w:t>User</w:t>
+      </w:r>
+      <w:proofErr w:type="gramEnd"/>
+      <w:r>
+        <w:rPr>
+          <w:sz w:val="22"/>
+          <w:szCs w:val="22"/>
+        </w:rPr>
+        <w:t xml:space="preserve"> interface </w:t>
+      </w:r>
+      <w:proofErr w:type="gramStart"/>
+      <w:r>
+        <w:rPr>
+          <w:sz w:val="22"/>
+          <w:szCs w:val="22"/>
+        </w:rPr>
+        <w:t>are</w:t>
+      </w:r>
+      <w:proofErr w:type="gramEnd"/>
+      <w:r>
+        <w:rPr>
+          <w:sz w:val="22"/>
+          <w:szCs w:val="22"/>
+        </w:rPr>
+        <w:t xml:space="preserve"> implemented</w:t>
       </w:r>
     </w:p>
     <w:p>
       <w:pPr>
         <w:numPr>
           <w:ilvl w:val="0"/>
-          <w:numId w:val="3"/>
+          <w:numId w:val="8"/>
         </w:numPr>
-      </w:pPr>
-      <w:r>
+        <w:rPr>
+          <w:sz w:val="22"/>
+          <w:szCs w:val="22"/>
+        </w:rPr>
+      </w:pPr>
+      <w:r>
+        <w:rPr>
+          <w:sz w:val="22"/>
+          <w:szCs w:val="22"/>
+        </w:rPr>
         <w:t>Proper git branching and committing is being used</w:t>
       </w:r>
     </w:p>
@@ -142,10 +369,18 @@
       <w:pPr>
         <w:numPr>
           <w:ilvl w:val="0"/>
-          <w:numId w:val="3"/>
+          <w:numId w:val="8"/>
         </w:numPr>
-      </w:pPr>
-      <w:r>
+        <w:rPr>
+          <w:sz w:val="22"/>
+          <w:szCs w:val="22"/>
+        </w:rPr>
+      </w:pPr>
+      <w:r>
+        <w:rPr>
+          <w:sz w:val="22"/>
+          <w:szCs w:val="22"/>
+        </w:rPr>
         <w:t>Many unit tests have been created to test functions and classes</w:t>
       </w:r>
     </w:p>
@@ -153,38 +388,98 @@
       <w:pPr>
         <w:numPr>
           <w:ilvl w:val="0"/>
-          <w:numId w:val="3"/>
+          <w:numId w:val="8"/>
         </w:numPr>
-      </w:pPr>
-      <w:r>
-        <w:t>Integrated build has been automated with github actions to ensure commits and merges are functional before being pushed</w:t>
+        <w:rPr>
+          <w:sz w:val="22"/>
+          <w:szCs w:val="22"/>
+        </w:rPr>
+      </w:pPr>
+      <w:r>
+        <w:rPr>
+          <w:sz w:val="22"/>
+          <w:szCs w:val="22"/>
+        </w:rPr>
+        <w:t xml:space="preserve">Integrated build has been automated with </w:t>
+      </w:r>
+      <w:proofErr w:type="spellStart"/>
+      <w:r>
+        <w:rPr>
+          <w:sz w:val="22"/>
+          <w:szCs w:val="22"/>
+        </w:rPr>
+        <w:t>github</w:t>
+      </w:r>
+      <w:proofErr w:type="spellEnd"/>
+      <w:r>
+        <w:rPr>
+          <w:sz w:val="22"/>
+          <w:szCs w:val="22"/>
+        </w:rPr>
+        <w:t xml:space="preserve"> actions to ensure commits and merges are functional before being pushed</w:t>
       </w:r>
     </w:p>
     <w:p>
       <w:pPr>
         <w:numPr>
           <w:ilvl w:val="0"/>
-          <w:numId w:val="3"/>
+          <w:numId w:val="8"/>
         </w:numPr>
-      </w:pPr>
-      <w:r>
-        <w:t>Javadoc has been configured to be automatically updated and accessible on github</w:t>
-      </w:r>
-    </w:p>
-    <w:p/>
-    <w:p>
-      <w:r>
-        <w:t>15/5/26 week 11</w:t>
-      </w:r>
+        <w:rPr>
+          <w:sz w:val="22"/>
+          <w:szCs w:val="22"/>
+        </w:rPr>
+      </w:pPr>
+      <w:r>
+        <w:rPr>
+          <w:sz w:val="22"/>
+          <w:szCs w:val="22"/>
+        </w:rPr>
+        <w:t xml:space="preserve">Javadoc has been configured to be automatically updated and accessible on </w:t>
+      </w:r>
+      <w:proofErr w:type="spellStart"/>
+      <w:r>
+        <w:rPr>
+          <w:sz w:val="22"/>
+          <w:szCs w:val="22"/>
+        </w:rPr>
+        <w:t>github</w:t>
+      </w:r>
+      <w:proofErr w:type="spellEnd"/>
     </w:p>
     <w:p>
       <w:pPr>
+        <w:rPr>
+          <w:b/>
+          <w:bCs/>
+          <w:u w:val="single"/>
+        </w:rPr>
+      </w:pPr>
+      <w:r>
+        <w:rPr>
+          <w:b/>
+          <w:bCs/>
+          <w:u w:val="single"/>
+        </w:rPr>
+        <w:t>15/5/26 week 11</w:t>
+      </w:r>
+    </w:p>
+    <w:p>
+      <w:pPr>
         <w:numPr>
           <w:ilvl w:val="0"/>
-          <w:numId w:val="4"/>
+          <w:numId w:val="9"/>
         </w:numPr>
-      </w:pPr>
-      <w:r>
+        <w:rPr>
+          <w:sz w:val="22"/>
+          <w:szCs w:val="22"/>
+        </w:rPr>
+      </w:pPr>
+      <w:r>
+        <w:rPr>
+          <w:sz w:val="22"/>
+          <w:szCs w:val="22"/>
+        </w:rPr>
         <w:t>Further feature implementation has been added </w:t>
       </w:r>
     </w:p>
@@ -192,27 +487,54 @@
       <w:pPr>
         <w:numPr>
           <w:ilvl w:val="0"/>
-          <w:numId w:val="4"/>
+          <w:numId w:val="9"/>
         </w:numPr>
-      </w:pPr>
-      <w:r>
+        <w:rPr>
+          <w:sz w:val="22"/>
+          <w:szCs w:val="22"/>
+        </w:rPr>
+      </w:pPr>
+      <w:r>
+        <w:rPr>
+          <w:sz w:val="22"/>
+          <w:szCs w:val="22"/>
+        </w:rPr>
         <w:t>Refactoring has occurred on all code to ensure best code quality and easier future feature implementation </w:t>
-      </w:r>
-    </w:p>
-    <w:p/>
-    <w:p>
-      <w:r>
-        <w:t>29/5/26 week 13</w:t>
       </w:r>
     </w:p>
     <w:p>
       <w:pPr>
+        <w:rPr>
+          <w:b/>
+          <w:bCs/>
+          <w:u w:val="single"/>
+        </w:rPr>
+      </w:pPr>
+      <w:r>
+        <w:rPr>
+          <w:b/>
+          <w:bCs/>
+          <w:u w:val="single"/>
+        </w:rPr>
+        <w:t>29/5/26 week 13</w:t>
+      </w:r>
+    </w:p>
+    <w:p>
+      <w:pPr>
         <w:numPr>
           <w:ilvl w:val="0"/>
-          <w:numId w:val="5"/>
+          <w:numId w:val="10"/>
         </w:numPr>
-      </w:pPr>
-      <w:r>
+        <w:rPr>
+          <w:sz w:val="22"/>
+          <w:szCs w:val="22"/>
+        </w:rPr>
+      </w:pPr>
+      <w:r>
+        <w:rPr>
+          <w:sz w:val="22"/>
+          <w:szCs w:val="22"/>
+        </w:rPr>
         <w:t>A final prototype has been produced with even more features implemented</w:t>
       </w:r>
     </w:p>
@@ -220,10 +542,18 @@
       <w:pPr>
         <w:numPr>
           <w:ilvl w:val="0"/>
-          <w:numId w:val="5"/>
+          <w:numId w:val="10"/>
         </w:numPr>
-      </w:pPr>
-      <w:r>
+        <w:rPr>
+          <w:sz w:val="22"/>
+          <w:szCs w:val="22"/>
+        </w:rPr>
+      </w:pPr>
+      <w:r>
+        <w:rPr>
+          <w:sz w:val="22"/>
+          <w:szCs w:val="22"/>
+        </w:rPr>
         <w:t>Feedback driven improvement has occurred </w:t>
       </w:r>
     </w:p>
@@ -231,10 +561,18 @@
       <w:pPr>
         <w:numPr>
           <w:ilvl w:val="0"/>
-          <w:numId w:val="5"/>
+          <w:numId w:val="10"/>
         </w:numPr>
-      </w:pPr>
-      <w:r>
+        <w:rPr>
+          <w:sz w:val="22"/>
+          <w:szCs w:val="22"/>
+        </w:rPr>
+      </w:pPr>
+      <w:r>
+        <w:rPr>
+          <w:sz w:val="22"/>
+          <w:szCs w:val="22"/>
+        </w:rPr>
         <w:t>Javadoc has been completed with all functions commented</w:t>
       </w:r>
     </w:p>
@@ -252,6 +590,155 @@
 <file path=word/numbering.xml><?xml version="1.0" encoding="utf-8"?>
 <w:numbering xmlns:wpc="http://schemas.microsoft.com/office/word/2010/wordprocessingCanvas" xmlns:cx="http://schemas.microsoft.com/office/drawing/2014/chartex" xmlns:cx1="http://schemas.microsoft.com/office/drawing/2015/9/8/chartex" xmlns:cx2="http://schemas.microsoft.com/office/drawing/2015/10/21/chartex" xmlns:cx3="http://schemas.microsoft.com/office/drawing/2016/5/9/chartex" xmlns:cx4="http://schemas.microsoft.com/office/drawing/2016/5/10/chartex" xmlns:cx5="http://schemas.microsoft.com/office/drawing/2016/5/11/chartex" xmlns:cx6="http://schemas.microsoft.com/office/drawing/2016/5/12/chartex" xmlns:cx7="http://schemas.microsoft.com/office/drawing/2016/5/13/chartex" xmlns:cx8="http://schemas.microsoft.com/office/drawing/2016/5/14/chartex" xmlns:mc="http://schemas.openxmlformats.org/markup-compatibility/2006" xmlns:aink="http://schemas.microsoft.com/office/drawing/2016/ink" xmlns:am3d="http://schemas.microsoft.com/office/drawing/2017/model3d" xmlns:o="urn:schemas-microsoft-com:office:office" xmlns:oel="http://schemas.microsoft.com/office/2019/extlst" xmlns:r="http://schemas.openxmlformats.org/officeDocument/2006/relationships" xmlns:m="http://schemas.openxmlformats.org/officeDocument/2006/math" xmlns:v="urn:schemas-microsoft-com:vml" xmlns:wp14="http://schemas.microsoft.com/office/word/2010/wordprocessingDrawing" xmlns:wp="http://schemas.openxmlformats.org/drawingml/2006/wordprocessingDrawing" xmlns:w10="urn:schemas-microsoft-com:office:word" xmlns:w="http://schemas.openxmlformats.org/wordprocessingml/2006/main" xmlns:w14="http://schemas.microsoft.com/office/word/2010/wordml" xmlns:w15="http://schemas.microsoft.com/office/word/2012/wordml" xmlns:w16cex="http://schemas.microsoft.com/office/word/2018/wordml/cex" xmlns:w16cid="http://schemas.microsoft.com/office/word/2016/wordml/cid" xmlns:w16="http://schemas.microsoft.com/office/word/2018/wordml" xmlns:w16du="http://schemas.microsoft.com/office/word/2023/wordml/word16du" xmlns:w16sdtdh="http://schemas.microsoft.com/office/word/2020/wordml/sdtdatahash" xmlns:w16sdtfl="http://schemas.microsoft.com/office/word/2024/wordml/sdtformatlock" xmlns:w16se="http://schemas.microsoft.com/office/word/2015/wordml/symex" xmlns:wpg="http://schemas.microsoft.com/office/word/2010/wordprocessingGroup" xmlns:wpi="http://schemas.microsoft.com/office/word/2010/wordprocessingInk" xmlns:wne="http://schemas.microsoft.com/office/word/2006/wordml" xmlns:wps="http://schemas.microsoft.com/office/word/2010/wordprocessingShape" mc:Ignorable="w14 w15 w16se w16cid w16 w16cex w16sdtdh w16sdtfl w16du wp14">
   <w:abstractNum w:abstractNumId="0" w15:restartNumberingAfterBreak="0">
+    <w:nsid w:val="14DE30A1"/>
+    <w:multiLevelType w:val="multilevel"/>
+    <w:tmpl w:val="B71642CC"/>
+    <w:lvl w:ilvl="0">
+      <w:start w:val="1"/>
+      <w:numFmt w:val="bullet"/>
+      <w:lvlText w:val=""/>
+      <w:lvlJc w:val="left"/>
+      <w:pPr>
+        <w:tabs>
+          <w:tab w:val="num" w:pos="720"/>
+        </w:tabs>
+        <w:ind w:left="720" w:hanging="360"/>
+      </w:pPr>
+      <w:rPr>
+        <w:rFonts w:ascii="Symbol" w:hAnsi="Symbol" w:hint="default"/>
+        <w:sz w:val="20"/>
+      </w:rPr>
+    </w:lvl>
+    <w:lvl w:ilvl="1" w:tentative="1">
+      <w:start w:val="1"/>
+      <w:numFmt w:val="bullet"/>
+      <w:lvlText w:val="o"/>
+      <w:lvlJc w:val="left"/>
+      <w:pPr>
+        <w:tabs>
+          <w:tab w:val="num" w:pos="1440"/>
+        </w:tabs>
+        <w:ind w:left="1440" w:hanging="360"/>
+      </w:pPr>
+      <w:rPr>
+        <w:rFonts w:ascii="Courier New" w:hAnsi="Courier New" w:hint="default"/>
+        <w:sz w:val="20"/>
+      </w:rPr>
+    </w:lvl>
+    <w:lvl w:ilvl="2" w:tentative="1">
+      <w:start w:val="1"/>
+      <w:numFmt w:val="bullet"/>
+      <w:lvlText w:val=""/>
+      <w:lvlJc w:val="left"/>
+      <w:pPr>
+        <w:tabs>
+          <w:tab w:val="num" w:pos="2160"/>
+        </w:tabs>
+        <w:ind w:left="2160" w:hanging="360"/>
+      </w:pPr>
+      <w:rPr>
+        <w:rFonts w:ascii="Wingdings" w:hAnsi="Wingdings" w:hint="default"/>
+        <w:sz w:val="20"/>
+      </w:rPr>
+    </w:lvl>
+    <w:lvl w:ilvl="3" w:tentative="1">
+      <w:start w:val="1"/>
+      <w:numFmt w:val="bullet"/>
+      <w:lvlText w:val=""/>
+      <w:lvlJc w:val="left"/>
+      <w:pPr>
+        <w:tabs>
+          <w:tab w:val="num" w:pos="2880"/>
+        </w:tabs>
+        <w:ind w:left="2880" w:hanging="360"/>
+      </w:pPr>
+      <w:rPr>
+        <w:rFonts w:ascii="Wingdings" w:hAnsi="Wingdings" w:hint="default"/>
+        <w:sz w:val="20"/>
+      </w:rPr>
+    </w:lvl>
+    <w:lvl w:ilvl="4" w:tentative="1">
+      <w:start w:val="1"/>
+      <w:numFmt w:val="bullet"/>
+      <w:lvlText w:val=""/>
+      <w:lvlJc w:val="left"/>
+      <w:pPr>
+        <w:tabs>
+          <w:tab w:val="num" w:pos="3600"/>
+        </w:tabs>
+        <w:ind w:left="3600" w:hanging="360"/>
+      </w:pPr>
+      <w:rPr>
+        <w:rFonts w:ascii="Wingdings" w:hAnsi="Wingdings" w:hint="default"/>
+        <w:sz w:val="20"/>
+      </w:rPr>
+    </w:lvl>
+    <w:lvl w:ilvl="5" w:tentative="1">
+      <w:start w:val="1"/>
+      <w:numFmt w:val="bullet"/>
+      <w:lvlText w:val=""/>
+      <w:lvlJc w:val="left"/>
+      <w:pPr>
+        <w:tabs>
+          <w:tab w:val="num" w:pos="4320"/>
+        </w:tabs>
+        <w:ind w:left="4320" w:hanging="360"/>
+      </w:pPr>
+      <w:rPr>
+        <w:rFonts w:ascii="Wingdings" w:hAnsi="Wingdings" w:hint="default"/>
+        <w:sz w:val="20"/>
+      </w:rPr>
+    </w:lvl>
+    <w:lvl w:ilvl="6" w:tentative="1">
+      <w:start w:val="1"/>
+      <w:numFmt w:val="bullet"/>
+      <w:lvlText w:val=""/>
+      <w:lvlJc w:val="left"/>
+      <w:pPr>
+        <w:tabs>
+          <w:tab w:val="num" w:pos="5040"/>
+        </w:tabs>
+        <w:ind w:left="5040" w:hanging="360"/>
+      </w:pPr>
+      <w:rPr>
+        <w:rFonts w:ascii="Wingdings" w:hAnsi="Wingdings" w:hint="default"/>
+        <w:sz w:val="20"/>
+      </w:rPr>
+    </w:lvl>
+    <w:lvl w:ilvl="7" w:tentative="1">
+      <w:start w:val="1"/>
+      <w:numFmt w:val="bullet"/>
+      <w:lvlText w:val=""/>
+      <w:lvlJc w:val="left"/>
+      <w:pPr>
+        <w:tabs>
+          <w:tab w:val="num" w:pos="5760"/>
+        </w:tabs>
+        <w:ind w:left="5760" w:hanging="360"/>
+      </w:pPr>
+      <w:rPr>
+        <w:rFonts w:ascii="Wingdings" w:hAnsi="Wingdings" w:hint="default"/>
+        <w:sz w:val="20"/>
+      </w:rPr>
+    </w:lvl>
+    <w:lvl w:ilvl="8" w:tentative="1">
+      <w:start w:val="1"/>
+      <w:numFmt w:val="bullet"/>
+      <w:lvlText w:val=""/>
+      <w:lvlJc w:val="left"/>
+      <w:pPr>
+        <w:tabs>
+          <w:tab w:val="num" w:pos="6480"/>
+        </w:tabs>
+        <w:ind w:left="6480" w:hanging="360"/>
+      </w:pPr>
+      <w:rPr>
+        <w:rFonts w:ascii="Wingdings" w:hAnsi="Wingdings" w:hint="default"/>
+        <w:sz w:val="20"/>
+      </w:rPr>
+    </w:lvl>
+  </w:abstractNum>
+  <w:abstractNum w:abstractNumId="1" w15:restartNumberingAfterBreak="0">
     <w:nsid w:val="36284F44"/>
     <w:multiLevelType w:val="multilevel"/>
     <w:tmpl w:val="36A01A6E"/>
@@ -400,7 +887,156 @@
       </w:rPr>
     </w:lvl>
   </w:abstractNum>
-  <w:abstractNum w:abstractNumId="1" w15:restartNumberingAfterBreak="0">
+  <w:abstractNum w:abstractNumId="2" w15:restartNumberingAfterBreak="0">
+    <w:nsid w:val="3AE772D3"/>
+    <w:multiLevelType w:val="multilevel"/>
+    <w:tmpl w:val="D55A8DBA"/>
+    <w:lvl w:ilvl="0">
+      <w:start w:val="1"/>
+      <w:numFmt w:val="bullet"/>
+      <w:lvlText w:val=""/>
+      <w:lvlJc w:val="left"/>
+      <w:pPr>
+        <w:tabs>
+          <w:tab w:val="num" w:pos="720"/>
+        </w:tabs>
+        <w:ind w:left="720" w:hanging="360"/>
+      </w:pPr>
+      <w:rPr>
+        <w:rFonts w:ascii="Symbol" w:hAnsi="Symbol" w:hint="default"/>
+        <w:sz w:val="20"/>
+      </w:rPr>
+    </w:lvl>
+    <w:lvl w:ilvl="1" w:tentative="1">
+      <w:start w:val="1"/>
+      <w:numFmt w:val="bullet"/>
+      <w:lvlText w:val="o"/>
+      <w:lvlJc w:val="left"/>
+      <w:pPr>
+        <w:tabs>
+          <w:tab w:val="num" w:pos="1440"/>
+        </w:tabs>
+        <w:ind w:left="1440" w:hanging="360"/>
+      </w:pPr>
+      <w:rPr>
+        <w:rFonts w:ascii="Courier New" w:hAnsi="Courier New" w:hint="default"/>
+        <w:sz w:val="20"/>
+      </w:rPr>
+    </w:lvl>
+    <w:lvl w:ilvl="2" w:tentative="1">
+      <w:start w:val="1"/>
+      <w:numFmt w:val="bullet"/>
+      <w:lvlText w:val=""/>
+      <w:lvlJc w:val="left"/>
+      <w:pPr>
+        <w:tabs>
+          <w:tab w:val="num" w:pos="2160"/>
+        </w:tabs>
+        <w:ind w:left="2160" w:hanging="360"/>
+      </w:pPr>
+      <w:rPr>
+        <w:rFonts w:ascii="Wingdings" w:hAnsi="Wingdings" w:hint="default"/>
+        <w:sz w:val="20"/>
+      </w:rPr>
+    </w:lvl>
+    <w:lvl w:ilvl="3" w:tentative="1">
+      <w:start w:val="1"/>
+      <w:numFmt w:val="bullet"/>
+      <w:lvlText w:val=""/>
+      <w:lvlJc w:val="left"/>
+      <w:pPr>
+        <w:tabs>
+          <w:tab w:val="num" w:pos="2880"/>
+        </w:tabs>
+        <w:ind w:left="2880" w:hanging="360"/>
+      </w:pPr>
+      <w:rPr>
+        <w:rFonts w:ascii="Wingdings" w:hAnsi="Wingdings" w:hint="default"/>
+        <w:sz w:val="20"/>
+      </w:rPr>
+    </w:lvl>
+    <w:lvl w:ilvl="4" w:tentative="1">
+      <w:start w:val="1"/>
+      <w:numFmt w:val="bullet"/>
+      <w:lvlText w:val=""/>
+      <w:lvlJc w:val="left"/>
+      <w:pPr>
+        <w:tabs>
+          <w:tab w:val="num" w:pos="3600"/>
+        </w:tabs>
+        <w:ind w:left="3600" w:hanging="360"/>
+      </w:pPr>
+      <w:rPr>
+        <w:rFonts w:ascii="Wingdings" w:hAnsi="Wingdings" w:hint="default"/>
+        <w:sz w:val="20"/>
+      </w:rPr>
+    </w:lvl>
+    <w:lvl w:ilvl="5" w:tentative="1">
+      <w:start w:val="1"/>
+      <w:numFmt w:val="bullet"/>
+      <w:lvlText w:val=""/>
+      <w:lvlJc w:val="left"/>
+      <w:pPr>
+        <w:tabs>
+          <w:tab w:val="num" w:pos="4320"/>
+        </w:tabs>
+        <w:ind w:left="4320" w:hanging="360"/>
+      </w:pPr>
+      <w:rPr>
+        <w:rFonts w:ascii="Wingdings" w:hAnsi="Wingdings" w:hint="default"/>
+        <w:sz w:val="20"/>
+      </w:rPr>
+    </w:lvl>
+    <w:lvl w:ilvl="6" w:tentative="1">
+      <w:start w:val="1"/>
+      <w:numFmt w:val="bullet"/>
+      <w:lvlText w:val=""/>
+      <w:lvlJc w:val="left"/>
+      <w:pPr>
+        <w:tabs>
+          <w:tab w:val="num" w:pos="5040"/>
+        </w:tabs>
+        <w:ind w:left="5040" w:hanging="360"/>
+      </w:pPr>
+      <w:rPr>
+        <w:rFonts w:ascii="Wingdings" w:hAnsi="Wingdings" w:hint="default"/>
+        <w:sz w:val="20"/>
+      </w:rPr>
+    </w:lvl>
+    <w:lvl w:ilvl="7" w:tentative="1">
+      <w:start w:val="1"/>
+      <w:numFmt w:val="bullet"/>
+      <w:lvlText w:val=""/>
+      <w:lvlJc w:val="left"/>
+      <w:pPr>
+        <w:tabs>
+          <w:tab w:val="num" w:pos="5760"/>
+        </w:tabs>
+        <w:ind w:left="5760" w:hanging="360"/>
+      </w:pPr>
+      <w:rPr>
+        <w:rFonts w:ascii="Wingdings" w:hAnsi="Wingdings" w:hint="default"/>
+        <w:sz w:val="20"/>
+      </w:rPr>
+    </w:lvl>
+    <w:lvl w:ilvl="8" w:tentative="1">
+      <w:start w:val="1"/>
+      <w:numFmt w:val="bullet"/>
+      <w:lvlText w:val=""/>
+      <w:lvlJc w:val="left"/>
+      <w:pPr>
+        <w:tabs>
+          <w:tab w:val="num" w:pos="6480"/>
+        </w:tabs>
+        <w:ind w:left="6480" w:hanging="360"/>
+      </w:pPr>
+      <w:rPr>
+        <w:rFonts w:ascii="Wingdings" w:hAnsi="Wingdings" w:hint="default"/>
+        <w:sz w:val="20"/>
+      </w:rPr>
+    </w:lvl>
+  </w:abstractNum>
+  <w:abstractNum w:abstractNumId="3" w15:restartNumberingAfterBreak="0">
     <w:nsid w:val="3C485F6F"/>
     <w:multiLevelType w:val="multilevel"/>
     <w:tmpl w:val="D4E4BE68"/>
@@ -549,7 +1185,7 @@
       </w:rPr>
     </w:lvl>
   </w:abstractNum>
-  <w:abstractNum w:abstractNumId="2" w15:restartNumberingAfterBreak="0">
+  <w:abstractNum w:abstractNumId="4" w15:restartNumberingAfterBreak="0">
     <w:nsid w:val="49F74C97"/>
     <w:multiLevelType w:val="multilevel"/>
     <w:tmpl w:val="E79AB274"/>
@@ -698,7 +1334,156 @@
       </w:rPr>
     </w:lvl>
   </w:abstractNum>
-  <w:abstractNum w:abstractNumId="3" w15:restartNumberingAfterBreak="0">
+  <w:abstractNum w:abstractNumId="5" w15:restartNumberingAfterBreak="0">
+    <w:nsid w:val="4E7367AB"/>
+    <w:multiLevelType w:val="multilevel"/>
+    <w:tmpl w:val="97F07160"/>
+    <w:lvl w:ilvl="0">
+      <w:start w:val="1"/>
+      <w:numFmt w:val="bullet"/>
+      <w:lvlText w:val=""/>
+      <w:lvlJc w:val="left"/>
+      <w:pPr>
+        <w:tabs>
+          <w:tab w:val="num" w:pos="720"/>
+        </w:tabs>
+        <w:ind w:left="720" w:hanging="360"/>
+      </w:pPr>
+      <w:rPr>
+        <w:rFonts w:ascii="Symbol" w:hAnsi="Symbol" w:hint="default"/>
+        <w:sz w:val="20"/>
+      </w:rPr>
+    </w:lvl>
+    <w:lvl w:ilvl="1" w:tentative="1">
+      <w:start w:val="1"/>
+      <w:numFmt w:val="bullet"/>
+      <w:lvlText w:val="o"/>
+      <w:lvlJc w:val="left"/>
+      <w:pPr>
+        <w:tabs>
+          <w:tab w:val="num" w:pos="1440"/>
+        </w:tabs>
+        <w:ind w:left="1440" w:hanging="360"/>
+      </w:pPr>
+      <w:rPr>
+        <w:rFonts w:ascii="Courier New" w:hAnsi="Courier New" w:hint="default"/>
+        <w:sz w:val="20"/>
+      </w:rPr>
+    </w:lvl>
+    <w:lvl w:ilvl="2" w:tentative="1">
+      <w:start w:val="1"/>
+      <w:numFmt w:val="bullet"/>
+      <w:lvlText w:val=""/>
+      <w:lvlJc w:val="left"/>
+      <w:pPr>
+        <w:tabs>
+          <w:tab w:val="num" w:pos="2160"/>
+        </w:tabs>
+        <w:ind w:left="2160" w:hanging="360"/>
+      </w:pPr>
+      <w:rPr>
+        <w:rFonts w:ascii="Wingdings" w:hAnsi="Wingdings" w:hint="default"/>
+        <w:sz w:val="20"/>
+      </w:rPr>
+    </w:lvl>
+    <w:lvl w:ilvl="3" w:tentative="1">
+      <w:start w:val="1"/>
+      <w:numFmt w:val="bullet"/>
+      <w:lvlText w:val=""/>
+      <w:lvlJc w:val="left"/>
+      <w:pPr>
+        <w:tabs>
+          <w:tab w:val="num" w:pos="2880"/>
+        </w:tabs>
+        <w:ind w:left="2880" w:hanging="360"/>
+      </w:pPr>
+      <w:rPr>
+        <w:rFonts w:ascii="Wingdings" w:hAnsi="Wingdings" w:hint="default"/>
+        <w:sz w:val="20"/>
+      </w:rPr>
+    </w:lvl>
+    <w:lvl w:ilvl="4" w:tentative="1">
+      <w:start w:val="1"/>
+      <w:numFmt w:val="bullet"/>
+      <w:lvlText w:val=""/>
+      <w:lvlJc w:val="left"/>
+      <w:pPr>
+        <w:tabs>
+          <w:tab w:val="num" w:pos="3600"/>
+        </w:tabs>
+        <w:ind w:left="3600" w:hanging="360"/>
+      </w:pPr>
+      <w:rPr>
+        <w:rFonts w:ascii="Wingdings" w:hAnsi="Wingdings" w:hint="default"/>
+        <w:sz w:val="20"/>
+      </w:rPr>
+    </w:lvl>
+    <w:lvl w:ilvl="5" w:tentative="1">
+      <w:start w:val="1"/>
+      <w:numFmt w:val="bullet"/>
+      <w:lvlText w:val=""/>
+      <w:lvlJc w:val="left"/>
+      <w:pPr>
+        <w:tabs>
+          <w:tab w:val="num" w:pos="4320"/>
+        </w:tabs>
+        <w:ind w:left="4320" w:hanging="360"/>
+      </w:pPr>
+      <w:rPr>
+        <w:rFonts w:ascii="Wingdings" w:hAnsi="Wingdings" w:hint="default"/>
+        <w:sz w:val="20"/>
+      </w:rPr>
+    </w:lvl>
+    <w:lvl w:ilvl="6" w:tentative="1">
+      <w:start w:val="1"/>
+      <w:numFmt w:val="bullet"/>
+      <w:lvlText w:val=""/>
+      <w:lvlJc w:val="left"/>
+      <w:pPr>
+        <w:tabs>
+          <w:tab w:val="num" w:pos="5040"/>
+        </w:tabs>
+        <w:ind w:left="5040" w:hanging="360"/>
+      </w:pPr>
+      <w:rPr>
+        <w:rFonts w:ascii="Wingdings" w:hAnsi="Wingdings" w:hint="default"/>
+        <w:sz w:val="20"/>
+      </w:rPr>
+    </w:lvl>
+    <w:lvl w:ilvl="7" w:tentative="1">
+      <w:start w:val="1"/>
+      <w:numFmt w:val="bullet"/>
+      <w:lvlText w:val=""/>
+      <w:lvlJc w:val="left"/>
+      <w:pPr>
+        <w:tabs>
+          <w:tab w:val="num" w:pos="5760"/>
+        </w:tabs>
+        <w:ind w:left="5760" w:hanging="360"/>
+      </w:pPr>
+      <w:rPr>
+        <w:rFonts w:ascii="Wingdings" w:hAnsi="Wingdings" w:hint="default"/>
+        <w:sz w:val="20"/>
+      </w:rPr>
+    </w:lvl>
+    <w:lvl w:ilvl="8" w:tentative="1">
+      <w:start w:val="1"/>
+      <w:numFmt w:val="bullet"/>
+      <w:lvlText w:val=""/>
+      <w:lvlJc w:val="left"/>
+      <w:pPr>
+        <w:tabs>
+          <w:tab w:val="num" w:pos="6480"/>
+        </w:tabs>
+        <w:ind w:left="6480" w:hanging="360"/>
+      </w:pPr>
+      <w:rPr>
+        <w:rFonts w:ascii="Wingdings" w:hAnsi="Wingdings" w:hint="default"/>
+        <w:sz w:val="20"/>
+      </w:rPr>
+    </w:lvl>
+  </w:abstractNum>
+  <w:abstractNum w:abstractNumId="6" w15:restartNumberingAfterBreak="0">
     <w:nsid w:val="55166DDE"/>
     <w:multiLevelType w:val="multilevel"/>
     <w:tmpl w:val="7F2669C2"/>
@@ -847,7 +1632,7 @@
       </w:rPr>
     </w:lvl>
   </w:abstractNum>
-  <w:abstractNum w:abstractNumId="4" w15:restartNumberingAfterBreak="0">
+  <w:abstractNum w:abstractNumId="7" w15:restartNumberingAfterBreak="0">
     <w:nsid w:val="588B260B"/>
     <w:multiLevelType w:val="multilevel"/>
     <w:tmpl w:val="63B80A8E"/>
@@ -996,20 +1781,333 @@
       </w:rPr>
     </w:lvl>
   </w:abstractNum>
+  <w:abstractNum w:abstractNumId="8" w15:restartNumberingAfterBreak="0">
+    <w:nsid w:val="60D5217A"/>
+    <w:multiLevelType w:val="multilevel"/>
+    <w:tmpl w:val="1B9EDC90"/>
+    <w:lvl w:ilvl="0">
+      <w:start w:val="1"/>
+      <w:numFmt w:val="bullet"/>
+      <w:lvlText w:val=""/>
+      <w:lvlJc w:val="left"/>
+      <w:pPr>
+        <w:tabs>
+          <w:tab w:val="num" w:pos="720"/>
+        </w:tabs>
+        <w:ind w:left="720" w:hanging="360"/>
+      </w:pPr>
+      <w:rPr>
+        <w:rFonts w:ascii="Symbol" w:hAnsi="Symbol" w:hint="default"/>
+        <w:sz w:val="20"/>
+      </w:rPr>
+    </w:lvl>
+    <w:lvl w:ilvl="1" w:tentative="1">
+      <w:start w:val="1"/>
+      <w:numFmt w:val="bullet"/>
+      <w:lvlText w:val="o"/>
+      <w:lvlJc w:val="left"/>
+      <w:pPr>
+        <w:tabs>
+          <w:tab w:val="num" w:pos="1440"/>
+        </w:tabs>
+        <w:ind w:left="1440" w:hanging="360"/>
+      </w:pPr>
+      <w:rPr>
+        <w:rFonts w:ascii="Courier New" w:hAnsi="Courier New" w:hint="default"/>
+        <w:sz w:val="20"/>
+      </w:rPr>
+    </w:lvl>
+    <w:lvl w:ilvl="2" w:tentative="1">
+      <w:start w:val="1"/>
+      <w:numFmt w:val="bullet"/>
+      <w:lvlText w:val=""/>
+      <w:lvlJc w:val="left"/>
+      <w:pPr>
+        <w:tabs>
+          <w:tab w:val="num" w:pos="2160"/>
+        </w:tabs>
+        <w:ind w:left="2160" w:hanging="360"/>
+      </w:pPr>
+      <w:rPr>
+        <w:rFonts w:ascii="Wingdings" w:hAnsi="Wingdings" w:hint="default"/>
+        <w:sz w:val="20"/>
+      </w:rPr>
+    </w:lvl>
+    <w:lvl w:ilvl="3" w:tentative="1">
+      <w:start w:val="1"/>
+      <w:numFmt w:val="bullet"/>
+      <w:lvlText w:val=""/>
+      <w:lvlJc w:val="left"/>
+      <w:pPr>
+        <w:tabs>
+          <w:tab w:val="num" w:pos="2880"/>
+        </w:tabs>
+        <w:ind w:left="2880" w:hanging="360"/>
+      </w:pPr>
+      <w:rPr>
+        <w:rFonts w:ascii="Wingdings" w:hAnsi="Wingdings" w:hint="default"/>
+        <w:sz w:val="20"/>
+      </w:rPr>
+    </w:lvl>
+    <w:lvl w:ilvl="4" w:tentative="1">
+      <w:start w:val="1"/>
+      <w:numFmt w:val="bullet"/>
+      <w:lvlText w:val=""/>
+      <w:lvlJc w:val="left"/>
+      <w:pPr>
+        <w:tabs>
+          <w:tab w:val="num" w:pos="3600"/>
+        </w:tabs>
+        <w:ind w:left="3600" w:hanging="360"/>
+      </w:pPr>
+      <w:rPr>
+        <w:rFonts w:ascii="Wingdings" w:hAnsi="Wingdings" w:hint="default"/>
+        <w:sz w:val="20"/>
+      </w:rPr>
+    </w:lvl>
+    <w:lvl w:ilvl="5" w:tentative="1">
+      <w:start w:val="1"/>
+      <w:numFmt w:val="bullet"/>
+      <w:lvlText w:val=""/>
+      <w:lvlJc w:val="left"/>
+      <w:pPr>
+        <w:tabs>
+          <w:tab w:val="num" w:pos="4320"/>
+        </w:tabs>
+        <w:ind w:left="4320" w:hanging="360"/>
+      </w:pPr>
+      <w:rPr>
+        <w:rFonts w:ascii="Wingdings" w:hAnsi="Wingdings" w:hint="default"/>
+        <w:sz w:val="20"/>
+      </w:rPr>
+    </w:lvl>
+    <w:lvl w:ilvl="6" w:tentative="1">
+      <w:start w:val="1"/>
+      <w:numFmt w:val="bullet"/>
+      <w:lvlText w:val=""/>
+      <w:lvlJc w:val="left"/>
+      <w:pPr>
+        <w:tabs>
+          <w:tab w:val="num" w:pos="5040"/>
+        </w:tabs>
+        <w:ind w:left="5040" w:hanging="360"/>
+      </w:pPr>
+      <w:rPr>
+        <w:rFonts w:ascii="Wingdings" w:hAnsi="Wingdings" w:hint="default"/>
+        <w:sz w:val="20"/>
+      </w:rPr>
+    </w:lvl>
+    <w:lvl w:ilvl="7" w:tentative="1">
+      <w:start w:val="1"/>
+      <w:numFmt w:val="bullet"/>
+      <w:lvlText w:val=""/>
+      <w:lvlJc w:val="left"/>
+      <w:pPr>
+        <w:tabs>
+          <w:tab w:val="num" w:pos="5760"/>
+        </w:tabs>
+        <w:ind w:left="5760" w:hanging="360"/>
+      </w:pPr>
+      <w:rPr>
+        <w:rFonts w:ascii="Wingdings" w:hAnsi="Wingdings" w:hint="default"/>
+        <w:sz w:val="20"/>
+      </w:rPr>
+    </w:lvl>
+    <w:lvl w:ilvl="8" w:tentative="1">
+      <w:start w:val="1"/>
+      <w:numFmt w:val="bullet"/>
+      <w:lvlText w:val=""/>
+      <w:lvlJc w:val="left"/>
+      <w:pPr>
+        <w:tabs>
+          <w:tab w:val="num" w:pos="6480"/>
+        </w:tabs>
+        <w:ind w:left="6480" w:hanging="360"/>
+      </w:pPr>
+      <w:rPr>
+        <w:rFonts w:ascii="Wingdings" w:hAnsi="Wingdings" w:hint="default"/>
+        <w:sz w:val="20"/>
+      </w:rPr>
+    </w:lvl>
+  </w:abstractNum>
+  <w:abstractNum w:abstractNumId="9" w15:restartNumberingAfterBreak="0">
+    <w:nsid w:val="69FA5CB2"/>
+    <w:multiLevelType w:val="multilevel"/>
+    <w:tmpl w:val="DB8E7AFE"/>
+    <w:lvl w:ilvl="0">
+      <w:start w:val="1"/>
+      <w:numFmt w:val="bullet"/>
+      <w:lvlText w:val=""/>
+      <w:lvlJc w:val="left"/>
+      <w:pPr>
+        <w:tabs>
+          <w:tab w:val="num" w:pos="720"/>
+        </w:tabs>
+        <w:ind w:left="720" w:hanging="360"/>
+      </w:pPr>
+      <w:rPr>
+        <w:rFonts w:ascii="Symbol" w:hAnsi="Symbol" w:hint="default"/>
+        <w:sz w:val="20"/>
+      </w:rPr>
+    </w:lvl>
+    <w:lvl w:ilvl="1" w:tentative="1">
+      <w:start w:val="1"/>
+      <w:numFmt w:val="bullet"/>
+      <w:lvlText w:val="o"/>
+      <w:lvlJc w:val="left"/>
+      <w:pPr>
+        <w:tabs>
+          <w:tab w:val="num" w:pos="1440"/>
+        </w:tabs>
+        <w:ind w:left="1440" w:hanging="360"/>
+      </w:pPr>
+      <w:rPr>
+        <w:rFonts w:ascii="Courier New" w:hAnsi="Courier New" w:hint="default"/>
+        <w:sz w:val="20"/>
+      </w:rPr>
+    </w:lvl>
+    <w:lvl w:ilvl="2" w:tentative="1">
+      <w:start w:val="1"/>
+      <w:numFmt w:val="bullet"/>
+      <w:lvlText w:val=""/>
+      <w:lvlJc w:val="left"/>
+      <w:pPr>
+        <w:tabs>
+          <w:tab w:val="num" w:pos="2160"/>
+        </w:tabs>
+        <w:ind w:left="2160" w:hanging="360"/>
+      </w:pPr>
+      <w:rPr>
+        <w:rFonts w:ascii="Wingdings" w:hAnsi="Wingdings" w:hint="default"/>
+        <w:sz w:val="20"/>
+      </w:rPr>
+    </w:lvl>
+    <w:lvl w:ilvl="3" w:tentative="1">
+      <w:start w:val="1"/>
+      <w:numFmt w:val="bullet"/>
+      <w:lvlText w:val=""/>
+      <w:lvlJc w:val="left"/>
+      <w:pPr>
+        <w:tabs>
+          <w:tab w:val="num" w:pos="2880"/>
+        </w:tabs>
+        <w:ind w:left="2880" w:hanging="360"/>
+      </w:pPr>
+      <w:rPr>
+        <w:rFonts w:ascii="Wingdings" w:hAnsi="Wingdings" w:hint="default"/>
+        <w:sz w:val="20"/>
+      </w:rPr>
+    </w:lvl>
+    <w:lvl w:ilvl="4" w:tentative="1">
+      <w:start w:val="1"/>
+      <w:numFmt w:val="bullet"/>
+      <w:lvlText w:val=""/>
+      <w:lvlJc w:val="left"/>
+      <w:pPr>
+        <w:tabs>
+          <w:tab w:val="num" w:pos="3600"/>
+        </w:tabs>
+        <w:ind w:left="3600" w:hanging="360"/>
+      </w:pPr>
+      <w:rPr>
+        <w:rFonts w:ascii="Wingdings" w:hAnsi="Wingdings" w:hint="default"/>
+        <w:sz w:val="20"/>
+      </w:rPr>
+    </w:lvl>
+    <w:lvl w:ilvl="5" w:tentative="1">
+      <w:start w:val="1"/>
+      <w:numFmt w:val="bullet"/>
+      <w:lvlText w:val=""/>
+      <w:lvlJc w:val="left"/>
+      <w:pPr>
+        <w:tabs>
+          <w:tab w:val="num" w:pos="4320"/>
+        </w:tabs>
+        <w:ind w:left="4320" w:hanging="360"/>
+      </w:pPr>
+      <w:rPr>
+        <w:rFonts w:ascii="Wingdings" w:hAnsi="Wingdings" w:hint="default"/>
+        <w:sz w:val="20"/>
+      </w:rPr>
+    </w:lvl>
+    <w:lvl w:ilvl="6" w:tentative="1">
+      <w:start w:val="1"/>
+      <w:numFmt w:val="bullet"/>
+      <w:lvlText w:val=""/>
+      <w:lvlJc w:val="left"/>
+      <w:pPr>
+        <w:tabs>
+          <w:tab w:val="num" w:pos="5040"/>
+        </w:tabs>
+        <w:ind w:left="5040" w:hanging="360"/>
+      </w:pPr>
+      <w:rPr>
+        <w:rFonts w:ascii="Wingdings" w:hAnsi="Wingdings" w:hint="default"/>
+        <w:sz w:val="20"/>
+      </w:rPr>
+    </w:lvl>
+    <w:lvl w:ilvl="7" w:tentative="1">
+      <w:start w:val="1"/>
+      <w:numFmt w:val="bullet"/>
+      <w:lvlText w:val=""/>
+      <w:lvlJc w:val="left"/>
+      <w:pPr>
+        <w:tabs>
+          <w:tab w:val="num" w:pos="5760"/>
+        </w:tabs>
+        <w:ind w:left="5760" w:hanging="360"/>
+      </w:pPr>
+      <w:rPr>
+        <w:rFonts w:ascii="Wingdings" w:hAnsi="Wingdings" w:hint="default"/>
+        <w:sz w:val="20"/>
+      </w:rPr>
+    </w:lvl>
+    <w:lvl w:ilvl="8" w:tentative="1">
+      <w:start w:val="1"/>
+      <w:numFmt w:val="bullet"/>
+      <w:lvlText w:val=""/>
+      <w:lvlJc w:val="left"/>
+      <w:pPr>
+        <w:tabs>
+          <w:tab w:val="num" w:pos="6480"/>
+        </w:tabs>
+        <w:ind w:left="6480" w:hanging="360"/>
+      </w:pPr>
+      <w:rPr>
+        <w:rFonts w:ascii="Wingdings" w:hAnsi="Wingdings" w:hint="default"/>
+        <w:sz w:val="20"/>
+      </w:rPr>
+    </w:lvl>
+  </w:abstractNum>
   <w:num w:numId="1" w16cid:durableId="662391741">
+    <w:abstractNumId w:val="3"/>
+  </w:num>
+  <w:num w:numId="2" w16cid:durableId="339284346">
+    <w:abstractNumId w:val="7"/>
+  </w:num>
+  <w:num w:numId="3" w16cid:durableId="718751133">
     <w:abstractNumId w:val="1"/>
   </w:num>
-  <w:num w:numId="2" w16cid:durableId="339284346">
+  <w:num w:numId="4" w16cid:durableId="1414934849">
+    <w:abstractNumId w:val="6"/>
+  </w:num>
+  <w:num w:numId="5" w16cid:durableId="1092508974">
     <w:abstractNumId w:val="4"/>
   </w:num>
-  <w:num w:numId="3" w16cid:durableId="718751133">
+  <w:num w:numId="6" w16cid:durableId="1552233258">
+    <w:abstractNumId w:val="2"/>
+  </w:num>
+  <w:num w:numId="7" w16cid:durableId="1895122903">
     <w:abstractNumId w:val="0"/>
   </w:num>
-  <w:num w:numId="4" w16cid:durableId="1414934849">
-    <w:abstractNumId w:val="3"/>
+  <w:num w:numId="8" w16cid:durableId="1886604248">
+    <w:abstractNumId w:val="5"/>
   </w:num>
-  <w:num w:numId="5" w16cid:durableId="1092508974">
-    <w:abstractNumId w:val="2"/>
+  <w:num w:numId="9" w16cid:durableId="115760610">
+    <w:abstractNumId w:val="8"/>
+  </w:num>
+  <w:num w:numId="10" w16cid:durableId="1800830769">
+    <w:abstractNumId w:val="9"/>
   </w:num>
 </w:numbering>
 </file>

</xml_diff>